<commit_message>
Add charge list view, invoice line dialog, search improvements, CSS theme updates
</commit_message>
<xml_diff>
--- a/🚀 Jmix Docker Deployment.docx
+++ b/🚀 Jmix Docker Deployment.docx
@@ -105,7 +105,7 @@
           <w:b/>
           <w:bCs/>
         </w:rPr>
-        <w:t>./gradlew bootJar</w:t>
+        <w:t xml:space="preserve">./gradlew clean bootJar -Pprod    </w:t>
       </w:r>
     </w:p>
     <w:p>
@@ -398,7 +398,7 @@
           <w:bCs/>
         </w:rPr>
         <w:pict w14:anchorId="0222D633">
-          <v:rect id="_x0000_i1063" style="width:0;height:1.5pt" o:hralign="center" o:hrstd="t" o:hr="t" fillcolor="#a0a0a0" stroked="f"/>
+          <v:rect id="_x0000_i1025" style="width:0;height:1.5pt" o:hralign="center" o:hrstd="t" o:hr="t" fillcolor="#a0a0a0" stroked="f"/>
         </w:pict>
       </w:r>
     </w:p>
@@ -545,7 +545,7 @@
           <w:bCs/>
         </w:rPr>
         <w:pict w14:anchorId="0D801B1A">
-          <v:rect id="_x0000_i1064" style="width:0;height:1.5pt" o:hralign="center" o:hrstd="t" o:hr="t" fillcolor="#a0a0a0" stroked="f"/>
+          <v:rect id="_x0000_i1026" style="width:0;height:1.5pt" o:hralign="center" o:hrstd="t" o:hr="t" fillcolor="#a0a0a0" stroked="f"/>
         </w:pict>
       </w:r>
     </w:p>
@@ -708,7 +708,7 @@
           <w:bCs/>
         </w:rPr>
         <w:pict w14:anchorId="069C6D3F">
-          <v:rect id="_x0000_i1065" style="width:0;height:1.5pt" o:hralign="center" o:hrstd="t" o:hr="t" fillcolor="#a0a0a0" stroked="f"/>
+          <v:rect id="_x0000_i1027" style="width:0;height:1.5pt" o:hralign="center" o:hrstd="t" o:hr="t" fillcolor="#a0a0a0" stroked="f"/>
         </w:pict>
       </w:r>
     </w:p>
@@ -3067,6 +3067,7 @@
   <w:style w:type="character" w:default="1" w:styleId="DefaultParagraphFont">
     <w:name w:val="Default Paragraph Font"/>
     <w:uiPriority w:val="1"/>
+    <w:semiHidden/>
     <w:unhideWhenUsed/>
   </w:style>
   <w:style w:type="table" w:default="1" w:styleId="TableNormal">

</xml_diff>